<commit_message>
CV : nouveau profil
</commit_message>
<xml_diff>
--- a/public/CV_Thomas_Labetouille.docx
+++ b/public/CV_Thomas_Labetouille.docx
@@ -180,7 +180,7 @@
               </w:rPr>
               <w:t xml:space="preserve">  •  </w:t>
             </w:r>
-            <w:hyperlink w:history="1" r:id="rIdsz7jwnnc2wlwkfxioztf6">
+            <w:hyperlink w:history="1" r:id="rId_1kaupbihxz4v_nnjkuzd">
               <w:r>
                 <w:rPr>
                   <w:rFonts w:ascii="Calibri" w:cs="Calibri" w:eastAsia="Calibri" w:hAnsi="Calibri"/>
@@ -201,7 +201,7 @@
               </w:rPr>
               <w:t xml:space="preserve">  •  </w:t>
             </w:r>
-            <w:hyperlink w:history="1" r:id="rIdszav0wemxzht702eklfle">
+            <w:hyperlink w:history="1" r:id="rIdpb-essdfpvcqyrghr3ewj">
               <w:r>
                 <w:rPr>
                   <w:rFonts w:ascii="Calibri" w:cs="Calibri" w:eastAsia="Calibri" w:hAnsi="Calibri"/>
@@ -222,7 +222,7 @@
               </w:rPr>
               <w:t xml:space="preserve">  •  </w:t>
             </w:r>
-            <w:hyperlink w:history="1" r:id="rIdsjcmlyauz4rf5gpt-bbtb">
+            <w:hyperlink w:history="1" r:id="rIdqxdnduhoh7afqqmovuxat">
               <w:r>
                 <w:rPr>
                   <w:rFonts w:ascii="Calibri" w:cs="Calibri" w:eastAsia="Calibri" w:hAnsi="Calibri"/>
@@ -286,7 +286,7 @@
           <w:sz w:val="19"/>
           <w:szCs w:val="19"/>
         </w:rPr>
-        <w:t xml:space="preserve">Systèmes bâtis autour de modèles de langage exécutés en local, outillage éditeur piloté par agent, et programmation gameplay sur Unreal Engine 5 (C++). Un fil commun : du code qui compile et qui a l'air de marcher n'est pas du code correct — chaque projet embarque donc de quoi le vérifier par le vrai chemin d'exécution (anti-régression, tests de propriétés, mutation testing, agents de playtest, CI).</w:t>
+        <w:t xml:space="preserve">Développeur logiciel, curieux et persévérant, à l'aise en autonomie comme en équipe distante. Je travaille sur des systèmes bâtis autour de modèles de langage, de l'outillage d'éditeur et du gameplay Unreal Engine 5 (C++). J'aime comprendre un système en profondeur avant d'y toucher, et je préfère vérifier qu'une chose fonctionne plutôt que de l'affirmer.</w:t>
       </w:r>
     </w:p>
     <w:p>

</xml_diff>